<commit_message>
Montar y actualizar plantillas/scripts en el contenedor para anular tiempos de ejecución Ordenar por prefijo numérico y alinear el nombre de archivos Renombrar plantillas para mayor claridad
</commit_message>
<xml_diff>
--- a/src/main/resources/templates/docgen/8/8.-DICTAMEN DE NIVEL DE CUMPLIMIENTO NORMATIVO.docx
+++ b/src/main/resources/templates/docgen/8/8.-DICTAMEN DE NIVEL DE CUMPLIMIENTO NORMATIVO.docx
@@ -608,14 +608,70 @@
           <w:rFonts w:ascii="Arial" w:hAnsi="Arial" w:cs="Arial"/>
           <w:color w:val="FF0000"/>
         </w:rPr>
-        <w:t>{{NPCA</w:t>
-      </w:r>
-      <w:r>
-        <w:rPr>
-          <w:rFonts w:ascii="Arial" w:hAnsi="Arial" w:cs="Arial"/>
-          <w:color w:val="FF0000"/>
-        </w:rPr>
-        <w:t>Q</w:t>
+        <w:t>{{</w:t>
+      </w:r>
+      <w:r>
+        <w:rPr>
+          <w:rFonts w:ascii="Arial" w:hAnsi="Arial" w:cs="Arial"/>
+          <w:color w:val="FF0000"/>
+        </w:rPr>
+        <w:t>NIVEL</w:t>
+      </w:r>
+      <w:r>
+        <w:rPr>
+          <w:rFonts w:ascii="Arial" w:hAnsi="Arial" w:cs="Arial"/>
+          <w:color w:val="FF0000"/>
+        </w:rPr>
+        <w:t>_</w:t>
+      </w:r>
+      <w:r>
+        <w:rPr>
+          <w:rFonts w:ascii="Arial" w:hAnsi="Arial" w:cs="Arial"/>
+          <w:color w:val="FF0000"/>
+        </w:rPr>
+        <w:t>PORCENTAJE</w:t>
+      </w:r>
+      <w:r>
+        <w:rPr>
+          <w:rFonts w:ascii="Arial" w:hAnsi="Arial" w:cs="Arial"/>
+          <w:color w:val="FF0000"/>
+        </w:rPr>
+        <w:t>_</w:t>
+      </w:r>
+      <w:r>
+        <w:rPr>
+          <w:rFonts w:ascii="Arial" w:hAnsi="Arial" w:cs="Arial"/>
+          <w:color w:val="FF0000"/>
+        </w:rPr>
+        <w:t>CUMPLIMIENTO</w:t>
+      </w:r>
+      <w:r>
+        <w:rPr>
+          <w:rFonts w:ascii="Arial" w:hAnsi="Arial" w:cs="Arial"/>
+          <w:color w:val="FF0000"/>
+        </w:rPr>
+        <w:t>_</w:t>
+      </w:r>
+      <w:r>
+        <w:rPr>
+          <w:rFonts w:ascii="Arial" w:hAnsi="Arial" w:cs="Arial"/>
+          <w:color w:val="FF0000"/>
+        </w:rPr>
+        <w:t>AGENTES</w:t>
+      </w:r>
+      <w:r>
+        <w:rPr>
+          <w:rFonts w:ascii="Arial" w:hAnsi="Arial" w:cs="Arial"/>
+          <w:color w:val="FF0000"/>
+        </w:rPr>
+        <w:t>_</w:t>
+      </w:r>
+      <w:r>
+        <w:rPr>
+          <w:rFonts w:ascii="Arial" w:hAnsi="Arial" w:cs="Arial"/>
+          <w:color w:val="FF0000"/>
+        </w:rPr>
+        <w:t>QUÍMICOS</w:t>
       </w:r>
       <w:r>
         <w:rPr>
@@ -663,7 +719,49 @@
           <w:rFonts w:ascii="Arial" w:hAnsi="Arial" w:cs="Arial"/>
           <w:color w:val="FF0000"/>
         </w:rPr>
-        <w:t>{{OAQ}}</w:t>
+        <w:t>{{</w:t>
+      </w:r>
+      <w:r>
+        <w:rPr>
+          <w:rFonts w:ascii="Arial" w:hAnsi="Arial" w:cs="Arial"/>
+          <w:color w:val="FF0000"/>
+        </w:rPr>
+        <w:t>OBSERVACIONES</w:t>
+      </w:r>
+      <w:r>
+        <w:rPr>
+          <w:rFonts w:ascii="Arial" w:hAnsi="Arial" w:cs="Arial"/>
+          <w:color w:val="FF0000"/>
+        </w:rPr>
+        <w:t>_</w:t>
+      </w:r>
+      <w:r>
+        <w:rPr>
+          <w:rFonts w:ascii="Arial" w:hAnsi="Arial" w:cs="Arial"/>
+          <w:color w:val="FF0000"/>
+        </w:rPr>
+        <w:t>AGENTES</w:t>
+      </w:r>
+      <w:r>
+        <w:rPr>
+          <w:rFonts w:ascii="Arial" w:hAnsi="Arial" w:cs="Arial"/>
+          <w:color w:val="FF0000"/>
+        </w:rPr>
+        <w:t>_</w:t>
+      </w:r>
+      <w:r>
+        <w:rPr>
+          <w:rFonts w:ascii="Arial" w:hAnsi="Arial" w:cs="Arial"/>
+          <w:color w:val="FF0000"/>
+        </w:rPr>
+        <w:t>QUÍMICOS</w:t>
+      </w:r>
+      <w:r>
+        <w:rPr>
+          <w:rFonts w:ascii="Arial" w:hAnsi="Arial" w:cs="Arial"/>
+          <w:color w:val="FF0000"/>
+        </w:rPr>
+        <w:t>}}</w:t>
       </w:r>
       <w:r>
         <w:rPr>
@@ -699,7 +797,6 @@
           <w:ilvl w:val="1"/>
           <w:numId w:val="2"/>
         </w:numPr>
-        <w:jc w:val="both"/>
         <w:rPr>
           <w:rFonts w:ascii="Arial" w:hAnsi="Arial" w:cs="Arial"/>
           <w:color w:val="FF0000"/>
@@ -724,7 +821,63 @@
           <w:rFonts w:ascii="Arial" w:hAnsi="Arial" w:cs="Arial"/>
           <w:color w:val="FF0000"/>
         </w:rPr>
-        <w:t>{{NPCR}}</w:t>
+        <w:t>{{</w:t>
+      </w:r>
+      <w:r>
+        <w:rPr>
+          <w:rFonts w:ascii="Arial" w:hAnsi="Arial" w:cs="Arial"/>
+          <w:color w:val="FF0000"/>
+        </w:rPr>
+        <w:t>NIVEL</w:t>
+      </w:r>
+      <w:r>
+        <w:rPr>
+          <w:rFonts w:ascii="Arial" w:hAnsi="Arial" w:cs="Arial"/>
+          <w:color w:val="FF0000"/>
+        </w:rPr>
+        <w:t>_</w:t>
+      </w:r>
+      <w:r>
+        <w:rPr>
+          <w:rFonts w:ascii="Arial" w:hAnsi="Arial" w:cs="Arial"/>
+          <w:color w:val="FF0000"/>
+        </w:rPr>
+        <w:t>PORCENTAJE</w:t>
+      </w:r>
+      <w:r>
+        <w:rPr>
+          <w:rFonts w:ascii="Arial" w:hAnsi="Arial" w:cs="Arial"/>
+          <w:color w:val="FF0000"/>
+        </w:rPr>
+        <w:t>_</w:t>
+      </w:r>
+      <w:r>
+        <w:rPr>
+          <w:rFonts w:ascii="Arial" w:hAnsi="Arial" w:cs="Arial"/>
+          <w:color w:val="FF0000"/>
+        </w:rPr>
+        <w:t>CUMPLIMIENTO</w:t>
+      </w:r>
+      <w:r>
+        <w:rPr>
+          <w:rFonts w:ascii="Arial" w:hAnsi="Arial" w:cs="Arial"/>
+          <w:color w:val="FF0000"/>
+        </w:rPr>
+        <w:t>_</w:t>
+      </w:r>
+      <w:r>
+        <w:rPr>
+          <w:rFonts w:ascii="Arial" w:hAnsi="Arial" w:cs="Arial"/>
+          <w:color w:val="FF0000"/>
+        </w:rPr>
+        <w:t>RUIDO</w:t>
+      </w:r>
+      <w:r>
+        <w:rPr>
+          <w:rFonts w:ascii="Arial" w:hAnsi="Arial" w:cs="Arial"/>
+          <w:color w:val="FF0000"/>
+        </w:rPr>
+        <w:t>}}</w:t>
       </w:r>
       <w:r>
         <w:rPr>
@@ -765,7 +918,35 @@
           <w:rFonts w:ascii="Arial" w:hAnsi="Arial" w:cs="Arial"/>
           <w:color w:val="FF0000"/>
         </w:rPr>
-        <w:t>{{OR}}</w:t>
+        <w:t>{{</w:t>
+      </w:r>
+      <w:r>
+        <w:rPr>
+          <w:rFonts w:ascii="Arial" w:hAnsi="Arial" w:cs="Arial"/>
+          <w:color w:val="FF0000"/>
+        </w:rPr>
+        <w:t>OBSERVACIONES</w:t>
+      </w:r>
+      <w:r>
+        <w:rPr>
+          <w:rFonts w:ascii="Arial" w:hAnsi="Arial" w:cs="Arial"/>
+          <w:color w:val="FF0000"/>
+        </w:rPr>
+        <w:t>_</w:t>
+      </w:r>
+      <w:r>
+        <w:rPr>
+          <w:rFonts w:ascii="Arial" w:hAnsi="Arial" w:cs="Arial"/>
+          <w:color w:val="FF0000"/>
+        </w:rPr>
+        <w:t>RUIDO</w:t>
+      </w:r>
+      <w:r>
+        <w:rPr>
+          <w:rFonts w:ascii="Arial" w:hAnsi="Arial" w:cs="Arial"/>
+          <w:color w:val="FF0000"/>
+        </w:rPr>
+        <w:t>}}</w:t>
       </w:r>
       <w:r>
         <w:rPr>
@@ -801,7 +982,6 @@
           <w:ilvl w:val="1"/>
           <w:numId w:val="2"/>
         </w:numPr>
-        <w:jc w:val="both"/>
         <w:rPr>
           <w:rFonts w:ascii="Arial" w:hAnsi="Arial" w:cs="Arial"/>
           <w:color w:val="FF0000"/>
@@ -826,7 +1006,63 @@
           <w:rFonts w:ascii="Arial" w:hAnsi="Arial" w:cs="Arial"/>
           <w:color w:val="FF0000"/>
         </w:rPr>
-        <w:t>{{NPRL}}</w:t>
+        <w:t>{{</w:t>
+      </w:r>
+      <w:r>
+        <w:rPr>
+          <w:rFonts w:ascii="Arial" w:hAnsi="Arial" w:cs="Arial"/>
+          <w:color w:val="FF0000"/>
+        </w:rPr>
+        <w:t>NIVEL</w:t>
+      </w:r>
+      <w:r>
+        <w:rPr>
+          <w:rFonts w:ascii="Arial" w:hAnsi="Arial" w:cs="Arial"/>
+          <w:color w:val="FF0000"/>
+        </w:rPr>
+        <w:t>_</w:t>
+      </w:r>
+      <w:r>
+        <w:rPr>
+          <w:rFonts w:ascii="Arial" w:hAnsi="Arial" w:cs="Arial"/>
+          <w:color w:val="FF0000"/>
+        </w:rPr>
+        <w:t>PORCENTAJE</w:t>
+      </w:r>
+      <w:r>
+        <w:rPr>
+          <w:rFonts w:ascii="Arial" w:hAnsi="Arial" w:cs="Arial"/>
+          <w:color w:val="FF0000"/>
+        </w:rPr>
+        <w:t>_</w:t>
+      </w:r>
+      <w:r>
+        <w:rPr>
+          <w:rFonts w:ascii="Arial" w:hAnsi="Arial" w:cs="Arial"/>
+          <w:color w:val="FF0000"/>
+        </w:rPr>
+        <w:t>RADIACIONES</w:t>
+      </w:r>
+      <w:r>
+        <w:rPr>
+          <w:rFonts w:ascii="Arial" w:hAnsi="Arial" w:cs="Arial"/>
+          <w:color w:val="FF0000"/>
+        </w:rPr>
+        <w:t>_</w:t>
+      </w:r>
+      <w:r>
+        <w:rPr>
+          <w:rFonts w:ascii="Arial" w:hAnsi="Arial" w:cs="Arial"/>
+          <w:color w:val="FF0000"/>
+        </w:rPr>
+        <w:t>IONIZANTES</w:t>
+      </w:r>
+      <w:r>
+        <w:rPr>
+          <w:rFonts w:ascii="Arial" w:hAnsi="Arial" w:cs="Arial"/>
+          <w:color w:val="FF0000"/>
+        </w:rPr>
+        <w:t>}}</w:t>
       </w:r>
       <w:r>
         <w:rPr>
@@ -867,7 +1103,49 @@
           <w:rFonts w:ascii="Arial" w:hAnsi="Arial" w:cs="Arial"/>
           <w:color w:val="FF0000"/>
         </w:rPr>
-        <w:t>{{ORL}}</w:t>
+        <w:t>{{</w:t>
+      </w:r>
+      <w:r>
+        <w:rPr>
+          <w:rFonts w:ascii="Arial" w:hAnsi="Arial" w:cs="Arial"/>
+          <w:color w:val="FF0000"/>
+        </w:rPr>
+        <w:t>OBSERVACIONES</w:t>
+      </w:r>
+      <w:r>
+        <w:rPr>
+          <w:rFonts w:ascii="Arial" w:hAnsi="Arial" w:cs="Arial"/>
+          <w:color w:val="FF0000"/>
+        </w:rPr>
+        <w:t>_</w:t>
+      </w:r>
+      <w:r>
+        <w:rPr>
+          <w:rFonts w:ascii="Arial" w:hAnsi="Arial" w:cs="Arial"/>
+          <w:color w:val="FF0000"/>
+        </w:rPr>
+        <w:t>RADIACIONES</w:t>
+      </w:r>
+      <w:r>
+        <w:rPr>
+          <w:rFonts w:ascii="Arial" w:hAnsi="Arial" w:cs="Arial"/>
+          <w:color w:val="FF0000"/>
+        </w:rPr>
+        <w:t>_</w:t>
+      </w:r>
+      <w:r>
+        <w:rPr>
+          <w:rFonts w:ascii="Arial" w:hAnsi="Arial" w:cs="Arial"/>
+          <w:color w:val="FF0000"/>
+        </w:rPr>
+        <w:t>IONIZANTES</w:t>
+      </w:r>
+      <w:r>
+        <w:rPr>
+          <w:rFonts w:ascii="Arial" w:hAnsi="Arial" w:cs="Arial"/>
+          <w:color w:val="FF0000"/>
+        </w:rPr>
+        <w:t>}}</w:t>
       </w:r>
       <w:r>
         <w:rPr>
@@ -903,7 +1181,6 @@
           <w:ilvl w:val="1"/>
           <w:numId w:val="2"/>
         </w:numPr>
-        <w:jc w:val="both"/>
         <w:rPr>
           <w:rFonts w:ascii="Arial" w:hAnsi="Arial" w:cs="Arial"/>
         </w:rPr>
@@ -927,7 +1204,77 @@
           <w:rFonts w:ascii="Arial" w:hAnsi="Arial" w:cs="Arial"/>
           <w:color w:val="FF0000"/>
         </w:rPr>
-        <w:t>{{NPRL}} %</w:t>
+        <w:t>{{</w:t>
+      </w:r>
+      <w:r>
+        <w:rPr>
+          <w:rFonts w:ascii="Arial" w:hAnsi="Arial" w:cs="Arial"/>
+          <w:color w:val="FF0000"/>
+        </w:rPr>
+        <w:t>NIVEL</w:t>
+      </w:r>
+      <w:r>
+        <w:rPr>
+          <w:rFonts w:ascii="Arial" w:hAnsi="Arial" w:cs="Arial"/>
+          <w:color w:val="FF0000"/>
+        </w:rPr>
+        <w:t>_</w:t>
+      </w:r>
+      <w:r>
+        <w:rPr>
+          <w:rFonts w:ascii="Arial" w:hAnsi="Arial" w:cs="Arial"/>
+          <w:color w:val="FF0000"/>
+        </w:rPr>
+        <w:t>PORCENTAJE</w:t>
+      </w:r>
+      <w:r>
+        <w:rPr>
+          <w:rFonts w:ascii="Arial" w:hAnsi="Arial" w:cs="Arial"/>
+          <w:color w:val="FF0000"/>
+        </w:rPr>
+        <w:t>_</w:t>
+      </w:r>
+      <w:r>
+        <w:rPr>
+          <w:rFonts w:ascii="Arial" w:hAnsi="Arial" w:cs="Arial"/>
+          <w:color w:val="FF0000"/>
+        </w:rPr>
+        <w:t>RADIACIONES</w:t>
+      </w:r>
+      <w:r>
+        <w:rPr>
+          <w:rFonts w:ascii="Arial" w:hAnsi="Arial" w:cs="Arial"/>
+          <w:color w:val="FF0000"/>
+        </w:rPr>
+        <w:t>_</w:t>
+      </w:r>
+      <w:r>
+        <w:rPr>
+          <w:rFonts w:ascii="Arial" w:hAnsi="Arial" w:cs="Arial"/>
+          <w:color w:val="FF0000"/>
+        </w:rPr>
+        <w:t>NO</w:t>
+      </w:r>
+      <w:r>
+        <w:rPr>
+          <w:rFonts w:ascii="Arial" w:hAnsi="Arial" w:cs="Arial"/>
+          <w:color w:val="FF0000"/>
+        </w:rPr>
+        <w:t>_</w:t>
+      </w:r>
+      <w:r>
+        <w:rPr>
+          <w:rFonts w:ascii="Arial" w:hAnsi="Arial" w:cs="Arial"/>
+          <w:color w:val="FF0000"/>
+        </w:rPr>
+        <w:t>IONIZANTES</w:t>
+      </w:r>
+      <w:r>
+        <w:rPr>
+          <w:rFonts w:ascii="Arial" w:hAnsi="Arial" w:cs="Arial"/>
+          <w:color w:val="FF0000"/>
+        </w:rPr>
+        <w:t>}} %</w:t>
       </w:r>
     </w:p>
     <w:p>
@@ -969,7 +1316,63 @@
           <w:rFonts w:ascii="Arial" w:hAnsi="Arial" w:cs="Arial"/>
           <w:color w:val="FF0000"/>
         </w:rPr>
-        <w:t>{{ORL}}.</w:t>
+        <w:t>{{</w:t>
+      </w:r>
+      <w:r>
+        <w:rPr>
+          <w:rFonts w:ascii="Arial" w:hAnsi="Arial" w:cs="Arial"/>
+          <w:color w:val="FF0000"/>
+        </w:rPr>
+        <w:t>OBSERVACIONES</w:t>
+      </w:r>
+      <w:r>
+        <w:rPr>
+          <w:rFonts w:ascii="Arial" w:hAnsi="Arial" w:cs="Arial"/>
+          <w:color w:val="FF0000"/>
+        </w:rPr>
+        <w:t>_</w:t>
+      </w:r>
+      <w:r>
+        <w:rPr>
+          <w:rFonts w:ascii="Arial" w:hAnsi="Arial" w:cs="Arial"/>
+          <w:color w:val="FF0000"/>
+        </w:rPr>
+        <w:t>RADIACIONES</w:t>
+      </w:r>
+      <w:r>
+        <w:rPr>
+          <w:rFonts w:ascii="Arial" w:hAnsi="Arial" w:cs="Arial"/>
+          <w:color w:val="FF0000"/>
+        </w:rPr>
+        <w:t>_</w:t>
+      </w:r>
+      <w:r>
+        <w:rPr>
+          <w:rFonts w:ascii="Arial" w:hAnsi="Arial" w:cs="Arial"/>
+          <w:color w:val="FF0000"/>
+        </w:rPr>
+        <w:t>NO</w:t>
+      </w:r>
+      <w:r>
+        <w:rPr>
+          <w:rFonts w:ascii="Arial" w:hAnsi="Arial" w:cs="Arial"/>
+          <w:color w:val="FF0000"/>
+        </w:rPr>
+        <w:t>_</w:t>
+      </w:r>
+      <w:r>
+        <w:rPr>
+          <w:rFonts w:ascii="Arial" w:hAnsi="Arial" w:cs="Arial"/>
+          <w:color w:val="FF0000"/>
+        </w:rPr>
+        <w:t>IONIZANTES</w:t>
+      </w:r>
+      <w:r>
+        <w:rPr>
+          <w:rFonts w:ascii="Arial" w:hAnsi="Arial" w:cs="Arial"/>
+          <w:color w:val="FF0000"/>
+        </w:rPr>
+        <w:t>}}.</w:t>
       </w:r>
     </w:p>
     <w:p>
@@ -998,7 +1401,6 @@
           <w:ilvl w:val="1"/>
           <w:numId w:val="2"/>
         </w:numPr>
-        <w:jc w:val="both"/>
         <w:rPr>
           <w:rFonts w:ascii="Arial" w:hAnsi="Arial" w:cs="Arial"/>
           <w:color w:val="FF0000"/>
@@ -1030,7 +1432,56 @@
           <w:rFonts w:ascii="Arial" w:hAnsi="Arial" w:cs="Arial"/>
           <w:color w:val="FF0000"/>
         </w:rPr>
-        <w:t>NCPA}}</w:t>
+        <w:t>NIVEL</w:t>
+      </w:r>
+      <w:r>
+        <w:rPr>
+          <w:rFonts w:ascii="Arial" w:hAnsi="Arial" w:cs="Arial"/>
+          <w:color w:val="FF0000"/>
+        </w:rPr>
+        <w:t>_</w:t>
+      </w:r>
+      <w:r>
+        <w:rPr>
+          <w:rFonts w:ascii="Arial" w:hAnsi="Arial" w:cs="Arial"/>
+          <w:color w:val="FF0000"/>
+        </w:rPr>
+        <w:t>CUMPLIMIENTO</w:t>
+      </w:r>
+      <w:r>
+        <w:rPr>
+          <w:rFonts w:ascii="Arial" w:hAnsi="Arial" w:cs="Arial"/>
+          <w:color w:val="FF0000"/>
+        </w:rPr>
+        <w:t>_</w:t>
+      </w:r>
+      <w:r>
+        <w:rPr>
+          <w:rFonts w:ascii="Arial" w:hAnsi="Arial" w:cs="Arial"/>
+          <w:color w:val="FF0000"/>
+        </w:rPr>
+        <w:t>PRESIONES</w:t>
+      </w:r>
+      <w:r>
+        <w:rPr>
+          <w:rFonts w:ascii="Arial" w:hAnsi="Arial" w:cs="Arial"/>
+          <w:color w:val="FF0000"/>
+        </w:rPr>
+        <w:t>_</w:t>
+      </w:r>
+      <w:r>
+        <w:rPr>
+          <w:rFonts w:ascii="Arial" w:hAnsi="Arial" w:cs="Arial"/>
+          <w:color w:val="FF0000"/>
+        </w:rPr>
+        <w:t>AMBIENTALES</w:t>
+      </w:r>
+      <w:r>
+        <w:rPr>
+          <w:rFonts w:ascii="Arial" w:hAnsi="Arial" w:cs="Arial"/>
+          <w:color w:val="FF0000"/>
+        </w:rPr>
+        <w:t>}}</w:t>
       </w:r>
       <w:r>
         <w:rPr>
@@ -1085,7 +1536,42 @@
           <w:rFonts w:ascii="Arial" w:hAnsi="Arial" w:cs="Arial"/>
           <w:color w:val="FF0000"/>
         </w:rPr>
-        <w:t>OPA}}</w:t>
+        <w:t>OBSERVACIONES</w:t>
+      </w:r>
+      <w:r>
+        <w:rPr>
+          <w:rFonts w:ascii="Arial" w:hAnsi="Arial" w:cs="Arial"/>
+          <w:color w:val="FF0000"/>
+        </w:rPr>
+        <w:t>_</w:t>
+      </w:r>
+      <w:r>
+        <w:rPr>
+          <w:rFonts w:ascii="Arial" w:hAnsi="Arial" w:cs="Arial"/>
+          <w:color w:val="FF0000"/>
+        </w:rPr>
+        <w:t>PRESIONES</w:t>
+      </w:r>
+      <w:r>
+        <w:rPr>
+          <w:rFonts w:ascii="Arial" w:hAnsi="Arial" w:cs="Arial"/>
+          <w:color w:val="FF0000"/>
+        </w:rPr>
+        <w:t>_</w:t>
+      </w:r>
+      <w:r>
+        <w:rPr>
+          <w:rFonts w:ascii="Arial" w:hAnsi="Arial" w:cs="Arial"/>
+          <w:color w:val="FF0000"/>
+        </w:rPr>
+        <w:t>AMBIENTALES</w:t>
+      </w:r>
+      <w:r>
+        <w:rPr>
+          <w:rFonts w:ascii="Arial" w:hAnsi="Arial" w:cs="Arial"/>
+          <w:color w:val="FF0000"/>
+        </w:rPr>
+        <w:t>}}</w:t>
       </w:r>
       <w:r>
         <w:rPr>
@@ -1121,7 +1607,6 @@
           <w:ilvl w:val="1"/>
           <w:numId w:val="2"/>
         </w:numPr>
-        <w:jc w:val="both"/>
         <w:rPr>
           <w:rFonts w:ascii="Arial" w:hAnsi="Arial" w:cs="Arial"/>
           <w:color w:val="FF0000"/>
@@ -1153,7 +1638,56 @@
           <w:rFonts w:ascii="Arial" w:hAnsi="Arial" w:cs="Arial"/>
           <w:color w:val="FF0000"/>
         </w:rPr>
-        <w:t>NCCT}}</w:t>
+        <w:t>NIVEL</w:t>
+      </w:r>
+      <w:r>
+        <w:rPr>
+          <w:rFonts w:ascii="Arial" w:hAnsi="Arial" w:cs="Arial"/>
+          <w:color w:val="FF0000"/>
+        </w:rPr>
+        <w:t>_</w:t>
+      </w:r>
+      <w:r>
+        <w:rPr>
+          <w:rFonts w:ascii="Arial" w:hAnsi="Arial" w:cs="Arial"/>
+          <w:color w:val="FF0000"/>
+        </w:rPr>
+        <w:t>CUMPLIMIENTO</w:t>
+      </w:r>
+      <w:r>
+        <w:rPr>
+          <w:rFonts w:ascii="Arial" w:hAnsi="Arial" w:cs="Arial"/>
+          <w:color w:val="FF0000"/>
+        </w:rPr>
+        <w:t>_</w:t>
+      </w:r>
+      <w:r>
+        <w:rPr>
+          <w:rFonts w:ascii="Arial" w:hAnsi="Arial" w:cs="Arial"/>
+          <w:color w:val="FF0000"/>
+        </w:rPr>
+        <w:t>CONDICIONES</w:t>
+      </w:r>
+      <w:r>
+        <w:rPr>
+          <w:rFonts w:ascii="Arial" w:hAnsi="Arial" w:cs="Arial"/>
+          <w:color w:val="FF0000"/>
+        </w:rPr>
+        <w:t>_</w:t>
+      </w:r>
+      <w:r>
+        <w:rPr>
+          <w:rFonts w:ascii="Arial" w:hAnsi="Arial" w:cs="Arial"/>
+          <w:color w:val="FF0000"/>
+        </w:rPr>
+        <w:t>TÉRMICAS</w:t>
+      </w:r>
+      <w:r>
+        <w:rPr>
+          <w:rFonts w:ascii="Arial" w:hAnsi="Arial" w:cs="Arial"/>
+          <w:color w:val="FF0000"/>
+        </w:rPr>
+        <w:t>}}</w:t>
       </w:r>
       <w:r>
         <w:rPr>
@@ -1200,7 +1734,49 @@
           <w:rFonts w:ascii="Arial" w:hAnsi="Arial" w:cs="Arial"/>
           <w:color w:val="FF0000"/>
         </w:rPr>
-        <w:t>{{OCT}}</w:t>
+        <w:t>{{</w:t>
+      </w:r>
+      <w:r>
+        <w:rPr>
+          <w:rFonts w:ascii="Arial" w:hAnsi="Arial" w:cs="Arial"/>
+          <w:color w:val="FF0000"/>
+        </w:rPr>
+        <w:t>OBSERVACIONES</w:t>
+      </w:r>
+      <w:r>
+        <w:rPr>
+          <w:rFonts w:ascii="Arial" w:hAnsi="Arial" w:cs="Arial"/>
+          <w:color w:val="FF0000"/>
+        </w:rPr>
+        <w:t>_</w:t>
+      </w:r>
+      <w:r>
+        <w:rPr>
+          <w:rFonts w:ascii="Arial" w:hAnsi="Arial" w:cs="Arial"/>
+          <w:color w:val="FF0000"/>
+        </w:rPr>
+        <w:t>CONDICIONES</w:t>
+      </w:r>
+      <w:r>
+        <w:rPr>
+          <w:rFonts w:ascii="Arial" w:hAnsi="Arial" w:cs="Arial"/>
+          <w:color w:val="FF0000"/>
+        </w:rPr>
+        <w:t>_</w:t>
+      </w:r>
+      <w:r>
+        <w:rPr>
+          <w:rFonts w:ascii="Arial" w:hAnsi="Arial" w:cs="Arial"/>
+          <w:color w:val="FF0000"/>
+        </w:rPr>
+        <w:t>TÉRMICAS</w:t>
+      </w:r>
+      <w:r>
+        <w:rPr>
+          <w:rFonts w:ascii="Arial" w:hAnsi="Arial" w:cs="Arial"/>
+          <w:color w:val="FF0000"/>
+        </w:rPr>
+        <w:t>}}</w:t>
       </w:r>
       <w:r>
         <w:rPr>
@@ -1255,7 +1831,49 @@
           <w:rFonts w:ascii="Arial" w:hAnsi="Arial" w:cs="Arial"/>
           <w:color w:val="FF0000"/>
         </w:rPr>
-        <w:t>{{NCV}}</w:t>
+        <w:t>{{</w:t>
+      </w:r>
+      <w:r>
+        <w:rPr>
+          <w:rFonts w:ascii="Arial" w:hAnsi="Arial" w:cs="Arial"/>
+          <w:color w:val="FF0000"/>
+        </w:rPr>
+        <w:t>NIVEL</w:t>
+      </w:r>
+      <w:r>
+        <w:rPr>
+          <w:rFonts w:ascii="Arial" w:hAnsi="Arial" w:cs="Arial"/>
+          <w:color w:val="FF0000"/>
+        </w:rPr>
+        <w:t>_</w:t>
+      </w:r>
+      <w:r>
+        <w:rPr>
+          <w:rFonts w:ascii="Arial" w:hAnsi="Arial" w:cs="Arial"/>
+          <w:color w:val="FF0000"/>
+        </w:rPr>
+        <w:t>CUMPLIMIENTO</w:t>
+      </w:r>
+      <w:r>
+        <w:rPr>
+          <w:rFonts w:ascii="Arial" w:hAnsi="Arial" w:cs="Arial"/>
+          <w:color w:val="FF0000"/>
+        </w:rPr>
+        <w:t>_</w:t>
+      </w:r>
+      <w:r>
+        <w:rPr>
+          <w:rFonts w:ascii="Arial" w:hAnsi="Arial" w:cs="Arial"/>
+          <w:color w:val="FF0000"/>
+        </w:rPr>
+        <w:t>VIBRACIONES</w:t>
+      </w:r>
+      <w:r>
+        <w:rPr>
+          <w:rFonts w:ascii="Arial" w:hAnsi="Arial" w:cs="Arial"/>
+          <w:color w:val="FF0000"/>
+        </w:rPr>
+        <w:t>}}</w:t>
       </w:r>
       <w:r>
         <w:rPr>
@@ -1302,7 +1920,35 @@
           <w:rFonts w:ascii="Arial" w:hAnsi="Arial" w:cs="Arial"/>
           <w:color w:val="FF0000"/>
         </w:rPr>
-        <w:t>{{OV}}</w:t>
+        <w:t>{{</w:t>
+      </w:r>
+      <w:r>
+        <w:rPr>
+          <w:rFonts w:ascii="Arial" w:hAnsi="Arial" w:cs="Arial"/>
+          <w:color w:val="FF0000"/>
+        </w:rPr>
+        <w:t>OBSERVACIONES</w:t>
+      </w:r>
+      <w:r>
+        <w:rPr>
+          <w:rFonts w:ascii="Arial" w:hAnsi="Arial" w:cs="Arial"/>
+          <w:color w:val="FF0000"/>
+        </w:rPr>
+        <w:t>_</w:t>
+      </w:r>
+      <w:r>
+        <w:rPr>
+          <w:rFonts w:ascii="Arial" w:hAnsi="Arial" w:cs="Arial"/>
+          <w:color w:val="FF0000"/>
+        </w:rPr>
+        <w:t>VIBRACIONES</w:t>
+      </w:r>
+      <w:r>
+        <w:rPr>
+          <w:rFonts w:ascii="Arial" w:hAnsi="Arial" w:cs="Arial"/>
+          <w:color w:val="FF0000"/>
+        </w:rPr>
+        <w:t>}}</w:t>
       </w:r>
       <w:r>
         <w:rPr>
@@ -1370,7 +2016,42 @@
           <w:rFonts w:ascii="Arial" w:hAnsi="Arial" w:cs="Arial"/>
           <w:color w:val="FF0000"/>
         </w:rPr>
-        <w:t>NCI}}</w:t>
+        <w:t>NIVEL</w:t>
+      </w:r>
+      <w:r>
+        <w:rPr>
+          <w:rFonts w:ascii="Arial" w:hAnsi="Arial" w:cs="Arial"/>
+          <w:color w:val="FF0000"/>
+        </w:rPr>
+        <w:t>_</w:t>
+      </w:r>
+      <w:r>
+        <w:rPr>
+          <w:rFonts w:ascii="Arial" w:hAnsi="Arial" w:cs="Arial"/>
+          <w:color w:val="FF0000"/>
+        </w:rPr>
+        <w:t>CUMPLIMIENTO</w:t>
+      </w:r>
+      <w:r>
+        <w:rPr>
+          <w:rFonts w:ascii="Arial" w:hAnsi="Arial" w:cs="Arial"/>
+          <w:color w:val="FF0000"/>
+        </w:rPr>
+        <w:t>_</w:t>
+      </w:r>
+      <w:r>
+        <w:rPr>
+          <w:rFonts w:ascii="Arial" w:hAnsi="Arial" w:cs="Arial"/>
+          <w:color w:val="FF0000"/>
+        </w:rPr>
+        <w:t>ILUMINACIÓN</w:t>
+      </w:r>
+      <w:r>
+        <w:rPr>
+          <w:rFonts w:ascii="Arial" w:hAnsi="Arial" w:cs="Arial"/>
+          <w:color w:val="FF0000"/>
+        </w:rPr>
+        <w:t>}}</w:t>
       </w:r>
       <w:r>
         <w:rPr>
@@ -1425,7 +2106,28 @@
           <w:rFonts w:ascii="Arial" w:hAnsi="Arial" w:cs="Arial"/>
           <w:color w:val="FF0000"/>
         </w:rPr>
-        <w:t>OI}}</w:t>
+        <w:t>OBSERVACIONES</w:t>
+      </w:r>
+      <w:r>
+        <w:rPr>
+          <w:rFonts w:ascii="Arial" w:hAnsi="Arial" w:cs="Arial"/>
+          <w:color w:val="FF0000"/>
+        </w:rPr>
+        <w:t>_</w:t>
+      </w:r>
+      <w:r>
+        <w:rPr>
+          <w:rFonts w:ascii="Arial" w:hAnsi="Arial" w:cs="Arial"/>
+          <w:color w:val="FF0000"/>
+        </w:rPr>
+        <w:t>ILUMINACIÓN</w:t>
+      </w:r>
+      <w:r>
+        <w:rPr>
+          <w:rFonts w:ascii="Arial" w:hAnsi="Arial" w:cs="Arial"/>
+          <w:color w:val="FF0000"/>
+        </w:rPr>
+        <w:t>}}</w:t>
       </w:r>
       <w:r>
         <w:rPr>
@@ -1461,7 +2163,6 @@
           <w:ilvl w:val="1"/>
           <w:numId w:val="2"/>
         </w:numPr>
-        <w:jc w:val="both"/>
         <w:rPr>
           <w:rFonts w:ascii="Arial" w:hAnsi="Arial" w:cs="Arial"/>
           <w:color w:val="FF0000"/>
@@ -1493,7 +2194,56 @@
           <w:rFonts w:ascii="Arial" w:hAnsi="Arial" w:cs="Arial"/>
           <w:color w:val="FF0000"/>
         </w:rPr>
-        <w:t>NCRP}}</w:t>
+        <w:t>NIVEL</w:t>
+      </w:r>
+      <w:r>
+        <w:rPr>
+          <w:rFonts w:ascii="Arial" w:hAnsi="Arial" w:cs="Arial"/>
+          <w:color w:val="FF0000"/>
+        </w:rPr>
+        <w:t>_</w:t>
+      </w:r>
+      <w:r>
+        <w:rPr>
+          <w:rFonts w:ascii="Arial" w:hAnsi="Arial" w:cs="Arial"/>
+          <w:color w:val="FF0000"/>
+        </w:rPr>
+        <w:t>CUMPLIMIENTO</w:t>
+      </w:r>
+      <w:r>
+        <w:rPr>
+          <w:rFonts w:ascii="Arial" w:hAnsi="Arial" w:cs="Arial"/>
+          <w:color w:val="FF0000"/>
+        </w:rPr>
+        <w:t>_</w:t>
+      </w:r>
+      <w:r>
+        <w:rPr>
+          <w:rFonts w:ascii="Arial" w:hAnsi="Arial" w:cs="Arial"/>
+          <w:color w:val="FF0000"/>
+        </w:rPr>
+        <w:t>RIESGO</w:t>
+      </w:r>
+      <w:r>
+        <w:rPr>
+          <w:rFonts w:ascii="Arial" w:hAnsi="Arial" w:cs="Arial"/>
+          <w:color w:val="FF0000"/>
+        </w:rPr>
+        <w:t>_</w:t>
+      </w:r>
+      <w:r>
+        <w:rPr>
+          <w:rFonts w:ascii="Arial" w:hAnsi="Arial" w:cs="Arial"/>
+          <w:color w:val="FF0000"/>
+        </w:rPr>
+        <w:t>PSICOSOCIAL</w:t>
+      </w:r>
+      <w:r>
+        <w:rPr>
+          <w:rFonts w:ascii="Arial" w:hAnsi="Arial" w:cs="Arial"/>
+          <w:color w:val="FF0000"/>
+        </w:rPr>
+        <w:t>}}</w:t>
       </w:r>
       <w:r>
         <w:rPr>
@@ -1548,7 +2298,42 @@
           <w:rFonts w:ascii="Arial" w:hAnsi="Arial" w:cs="Arial"/>
           <w:color w:val="FF0000"/>
         </w:rPr>
-        <w:t>ORP}}</w:t>
+        <w:t>OBSERVACIONES</w:t>
+      </w:r>
+      <w:r>
+        <w:rPr>
+          <w:rFonts w:ascii="Arial" w:hAnsi="Arial" w:cs="Arial"/>
+          <w:color w:val="FF0000"/>
+        </w:rPr>
+        <w:t>_</w:t>
+      </w:r>
+      <w:r>
+        <w:rPr>
+          <w:rFonts w:ascii="Arial" w:hAnsi="Arial" w:cs="Arial"/>
+          <w:color w:val="FF0000"/>
+        </w:rPr>
+        <w:t>RIESGO</w:t>
+      </w:r>
+      <w:r>
+        <w:rPr>
+          <w:rFonts w:ascii="Arial" w:hAnsi="Arial" w:cs="Arial"/>
+          <w:color w:val="FF0000"/>
+        </w:rPr>
+        <w:t>_</w:t>
+      </w:r>
+      <w:r>
+        <w:rPr>
+          <w:rFonts w:ascii="Arial" w:hAnsi="Arial" w:cs="Arial"/>
+          <w:color w:val="FF0000"/>
+        </w:rPr>
+        <w:t>PSICOSOCIAL</w:t>
+      </w:r>
+      <w:r>
+        <w:rPr>
+          <w:rFonts w:ascii="Arial" w:hAnsi="Arial" w:cs="Arial"/>
+          <w:color w:val="FF0000"/>
+        </w:rPr>
+        <w:t>}}</w:t>
       </w:r>
       <w:r>
         <w:rPr>
@@ -1575,6 +2360,7 @@
           <w:b/>
           <w:bCs/>
         </w:rPr>
+        <w:lastRenderedPageBreak/>
         <w:t>NOM-036-STPS-2018. FACTORES DE RIESGO ERGONÓMICO. PARTE 1: MANEJO MANUAL DE CARGAS:</w:t>
       </w:r>
     </w:p>
@@ -1584,7 +2370,6 @@
           <w:ilvl w:val="1"/>
           <w:numId w:val="2"/>
         </w:numPr>
-        <w:jc w:val="both"/>
         <w:rPr>
           <w:rFonts w:ascii="Arial" w:hAnsi="Arial" w:cs="Arial"/>
           <w:color w:val="FF0000"/>
@@ -1616,7 +2401,56 @@
           <w:rFonts w:ascii="Arial" w:hAnsi="Arial" w:cs="Arial"/>
           <w:color w:val="FF0000"/>
         </w:rPr>
-        <w:t>NCRE}}</w:t>
+        <w:t>NIVEL</w:t>
+      </w:r>
+      <w:r>
+        <w:rPr>
+          <w:rFonts w:ascii="Arial" w:hAnsi="Arial" w:cs="Arial"/>
+          <w:color w:val="FF0000"/>
+        </w:rPr>
+        <w:t>_</w:t>
+      </w:r>
+      <w:r>
+        <w:rPr>
+          <w:rFonts w:ascii="Arial" w:hAnsi="Arial" w:cs="Arial"/>
+          <w:color w:val="FF0000"/>
+        </w:rPr>
+        <w:t>CUMPLIMIENTO</w:t>
+      </w:r>
+      <w:r>
+        <w:rPr>
+          <w:rFonts w:ascii="Arial" w:hAnsi="Arial" w:cs="Arial"/>
+          <w:color w:val="FF0000"/>
+        </w:rPr>
+        <w:t>_</w:t>
+      </w:r>
+      <w:r>
+        <w:rPr>
+          <w:rFonts w:ascii="Arial" w:hAnsi="Arial" w:cs="Arial"/>
+          <w:color w:val="FF0000"/>
+        </w:rPr>
+        <w:t>RIESGO</w:t>
+      </w:r>
+      <w:r>
+        <w:rPr>
+          <w:rFonts w:ascii="Arial" w:hAnsi="Arial" w:cs="Arial"/>
+          <w:color w:val="FF0000"/>
+        </w:rPr>
+        <w:t>_</w:t>
+      </w:r>
+      <w:r>
+        <w:rPr>
+          <w:rFonts w:ascii="Arial" w:hAnsi="Arial" w:cs="Arial"/>
+          <w:color w:val="FF0000"/>
+        </w:rPr>
+        <w:t>ERGONÓMICO</w:t>
+      </w:r>
+      <w:r>
+        <w:rPr>
+          <w:rFonts w:ascii="Arial" w:hAnsi="Arial" w:cs="Arial"/>
+          <w:color w:val="FF0000"/>
+        </w:rPr>
+        <w:t>}}</w:t>
       </w:r>
       <w:r>
         <w:rPr>
@@ -1671,7 +2505,42 @@
           <w:rFonts w:ascii="Arial" w:hAnsi="Arial" w:cs="Arial"/>
           <w:color w:val="FF0000"/>
         </w:rPr>
-        <w:t>ORE}}</w:t>
+        <w:t>OBSERVACIONES</w:t>
+      </w:r>
+      <w:r>
+        <w:rPr>
+          <w:rFonts w:ascii="Arial" w:hAnsi="Arial" w:cs="Arial"/>
+          <w:color w:val="FF0000"/>
+        </w:rPr>
+        <w:t>_</w:t>
+      </w:r>
+      <w:r>
+        <w:rPr>
+          <w:rFonts w:ascii="Arial" w:hAnsi="Arial" w:cs="Arial"/>
+          <w:color w:val="FF0000"/>
+        </w:rPr>
+        <w:t>RIESGO</w:t>
+      </w:r>
+      <w:r>
+        <w:rPr>
+          <w:rFonts w:ascii="Arial" w:hAnsi="Arial" w:cs="Arial"/>
+          <w:color w:val="FF0000"/>
+        </w:rPr>
+        <w:t>_</w:t>
+      </w:r>
+      <w:r>
+        <w:rPr>
+          <w:rFonts w:ascii="Arial" w:hAnsi="Arial" w:cs="Arial"/>
+          <w:color w:val="FF0000"/>
+        </w:rPr>
+        <w:t>ERGONÓMICO</w:t>
+      </w:r>
+      <w:r>
+        <w:rPr>
+          <w:rFonts w:ascii="Arial" w:hAnsi="Arial" w:cs="Arial"/>
+          <w:color w:val="FF0000"/>
+        </w:rPr>
+        <w:t>}}</w:t>
       </w:r>
       <w:r>
         <w:rPr>
@@ -1708,7 +2577,6 @@
           <w:sz w:val="24"/>
           <w:szCs w:val="24"/>
         </w:rPr>
-        <w:lastRenderedPageBreak/>
         <w:t>CONCLUSIONES:</w:t>
       </w:r>
     </w:p>
@@ -1758,14 +2626,35 @@
           <w:rFonts w:ascii="Arial" w:hAnsi="Arial" w:cs="Arial"/>
           <w:color w:val="FF0000"/>
         </w:rPr>
-        <w:t>NC</w:t>
-      </w:r>
-      <w:r>
-        <w:rPr>
-          <w:rFonts w:ascii="Arial" w:hAnsi="Arial" w:cs="Arial"/>
-          <w:color w:val="FF0000"/>
-        </w:rPr>
-        <w:t>G</w:t>
+        <w:t>NIVEL</w:t>
+      </w:r>
+      <w:r>
+        <w:rPr>
+          <w:rFonts w:ascii="Arial" w:hAnsi="Arial" w:cs="Arial"/>
+          <w:color w:val="FF0000"/>
+        </w:rPr>
+        <w:t>_</w:t>
+      </w:r>
+      <w:r>
+        <w:rPr>
+          <w:rFonts w:ascii="Arial" w:hAnsi="Arial" w:cs="Arial"/>
+          <w:color w:val="FF0000"/>
+        </w:rPr>
+        <w:t>CUMPLIMIENTO</w:t>
+      </w:r>
+      <w:r>
+        <w:rPr>
+          <w:rFonts w:ascii="Arial" w:hAnsi="Arial" w:cs="Arial"/>
+          <w:color w:val="FF0000"/>
+        </w:rPr>
+        <w:t>_</w:t>
+      </w:r>
+      <w:r>
+        <w:rPr>
+          <w:rFonts w:ascii="Arial" w:hAnsi="Arial" w:cs="Arial"/>
+          <w:color w:val="FF0000"/>
+        </w:rPr>
+        <w:t>GENERAL</w:t>
       </w:r>
       <w:r>
         <w:rPr>

</xml_diff>